<commit_message>
Update D365 Config Framework: Hetzner stack corrections + schema alignment
- Replace all person_spine refs with donor_intelligence.person_master
- Replace all Supabase refs with actual Hetzner stack:
  pgcrypto, pg_cron, Postgres RLS, Redis pub/sub, relay.py, brain.event_queue
- Block 02: pipeline.data_sources IS the connection reference table (PARTIAL not MISSING)
- Block 13: platform schema already deployed on Hetzner (8 tables, 60 ecosystems)
- Block 14: donation flow rewritten to match actual pipeline:
  relay.py -> Redis bgop:events -> brain.event_queue -> pipeline.inbound_data_queue -> contribution_map
- Critical gap callout: brain worker (Redis subscriber) not yet running
- Supabase role clarified: agent_messages + brain_decisions only; all data on Hetzner PG16

Co-Authored-By: Claude Sonnet 4.6 <noreply@anthropic.com>
</commit_message>
<xml_diff>
--- a/docs/BROYHILLGOP_D365_CONFIG_FRAMEWORK.docx
+++ b/docs/BROYHILLGOP_D365_CONFIG_FRAMEWORK.docx
@@ -706,7 +706,7 @@
               <w:bottom w:val="single" w:color="D0D7DE" w:sz="1"/>
               <w:right w:val="single" w:color="D0D7DE" w:sz="1"/>
             </w:tcBorders>
-            <w:shd w:fill="B71C1C" w:val="clear"/>
+            <w:shd w:fill="E65100" w:val="clear"/>
             <w:tcMar>
               <w:top w:type="dxa" w:w="80"/>
               <w:left w:type="dxa" w:w="120"/>
@@ -727,7 +727,7 @@
                 <w:sz w:val="17"/>
                 <w:szCs w:val="17"/>
               </w:rPr>
-              <w:t xml:space="preserve">GAP — MUST BUILD</w:t>
+              <w:t xml:space="preserve">PARTIALLY BUILT</w:t>
             </w:r>
           </w:p>
         </w:tc>
@@ -2634,7 +2634,7 @@
                 <w:sz w:val="18"/>
                 <w:szCs w:val="18"/>
               </w:rPr>
-              <w:t xml:space="preserve">Create a bgop_config table in Supabase. Every Python file that today contains a hardcoded value or an .env read should instead call bgop_config.get('KEY', environment='prod'). Three environments: local / staging / prod. Table is never deployed — values live in the DB.</w:t>
+              <w:t xml:space="preserve">Create a bgop_config table in Hetzner PG16. Every Python file that today contains a hardcoded value or an .env read should instead call bgop_config.get('KEY', environment='prod'). Three environments: local / staging / prod. Table is never deployed — values live in the DB.</w:t>
             </w:r>
           </w:p>
         </w:tc>
@@ -3105,7 +3105,7 @@
                 <w:sz w:val="18"/>
                 <w:szCs w:val="18"/>
               </w:rPr>
-              <w:t xml:space="preserve">is_secret BOOLEAN, Supabase column encryption</w:t>
+              <w:t xml:space="preserve">is_secret BOOLEAN, pgcrypto encryption (Hetzner PG16)</w:t>
             </w:r>
           </w:p>
         </w:tc>
@@ -3936,7 +3936,7 @@
                 <w:sz w:val="18"/>
                 <w:szCs w:val="18"/>
               </w:rPr>
-              <w:t xml:space="preserve">DIRECT TRANSLATION</w:t>
+              <w:t xml:space="preserve">DIRECT TRANSLATION — PARTIALLY BUILT</w:t>
             </w:r>
           </w:p>
         </w:tc>
@@ -3997,7 +3997,7 @@
                 <w:sz w:val="18"/>
                 <w:szCs w:val="18"/>
               </w:rPr>
-              <w:t xml:space="preserve">Create a bgop_integration_credentials table. Every API integration (NGP VAN, Apollo, SendGrid, Braintree, Twilio, Google, DataTrust) has a row. Python files import credentials by name, never inline. Credential rotation is a single DB UPDATE, not a code commit.</w:t>
+              <w:t xml:space="preserve">pipeline.data_sources already implements the Connection Reference pattern: every integration (DataTrust, FEC, NCBOE, Acxiom, WinRed, Anedot) has a row with connection_config JSONB using 'api_key_ref': 'vault:...' notation — the secret is a pointer, not a value. 9 source rows are seeded at deploy. The gap: the vault: references are a naming convention not yet backed by pgcrypto storage, and non-data-source integrations (NGP VAN, SendGrid, Twilio, Apollo) are not yet in data_sources. Extend data_sources to cover all integrations or add a companion bgop_integration_credentials table for non-data-source vendor APIs.</w:t>
             </w:r>
           </w:p>
         </w:tc>
@@ -4058,7 +4058,7 @@
                 <w:sz w:val="18"/>
                 <w:szCs w:val="18"/>
               </w:rPr>
-              <w:t xml:space="preserve">GAP — MUST BUILD</w:t>
+              <w:t xml:space="preserve">PARTIALLY BUILT</w:t>
             </w:r>
           </w:p>
         </w:tc>
@@ -4282,7 +4282,7 @@
                 <w:sz w:val="18"/>
                 <w:szCs w:val="18"/>
               </w:rPr>
-              <w:t xml:space="preserve">integration_type, api_version columns</w:t>
+              <w:t xml:space="preserve">pipeline.data_sources: source_type, data_schema_version columns</w:t>
             </w:r>
           </w:p>
         </w:tc>
@@ -4375,7 +4375,7 @@
                 <w:sz w:val="18"/>
                 <w:szCs w:val="18"/>
               </w:rPr>
-              <w:t xml:space="preserve">api_key, secret stored with Supabase vault</w:t>
+              <w:t xml:space="preserve">connection_config JSONB: {api_key_ref:'vault:...'} — pgcrypto backing needed</w:t>
             </w:r>
           </w:p>
         </w:tc>
@@ -4468,7 +4468,7 @@
                 <w:sz w:val="18"/>
                 <w:szCs w:val="18"/>
               </w:rPr>
-              <w:t xml:space="preserve">sandbox vs. prod credentials per env row</w:t>
+              <w:t xml:space="preserve">Add environment column to data_sources (currently implicit)</w:t>
             </w:r>
           </w:p>
         </w:tc>
@@ -4561,7 +4561,7 @@
                 <w:sz w:val="18"/>
                 <w:szCs w:val="18"/>
               </w:rPr>
-              <w:t xml:space="preserve">service_account column (which BGOP role owns it)</w:t>
+              <w:t xml:space="preserve">data_sources: vendor_contact_name/email as owner reference</w:t>
             </w:r>
           </w:p>
         </w:tc>
@@ -4654,7 +4654,7 @@
                 <w:sz w:val="18"/>
                 <w:szCs w:val="18"/>
               </w:rPr>
-              <w:t xml:space="preserve">rotated_at, expires_at columns + alerts</w:t>
+              <w:t xml:space="preserve">data_sources: vendor_contract_expires + last_refresh_at</w:t>
             </w:r>
           </w:p>
         </w:tc>
@@ -4684,7 +4684,7 @@
                 <w:sz w:val="18"/>
                 <w:szCs w:val="18"/>
               </w:rPr>
-              <w:t xml:space="preserve">Dependency map (which flows use this)</w:t>
+              <w:t xml:space="preserve">Reliability / health tracking</w:t>
             </w:r>
           </w:p>
         </w:tc>
@@ -4697,7 +4697,7 @@
               <w:bottom w:val="none" w:color="FFFFFF" w:sz="0"/>
               <w:right w:val="none" w:color="FFFFFF" w:sz="0"/>
             </w:tcBorders>
-            <w:shd w:fill="E65100" w:val="clear"/>
+            <w:shd w:fill="1B3A6B" w:val="clear"/>
             <w:tcMar>
               <w:top w:type="dxa" w:w="80"/>
               <w:left w:type="dxa" w:w="180"/>
@@ -4719,6 +4719,99 @@
                 <w:sz w:val="16"/>
                 <w:szCs w:val="16"/>
               </w:rPr>
+              <w:t xml:space="preserve">DIRECT TRANSLATION</w:t>
+            </w:r>
+          </w:p>
+        </w:tc>
+        <w:tc>
+          <w:tcPr>
+            <w:tcW w:type="dxa" w:w="3560"/>
+            <w:tcBorders>
+              <w:top w:val="single" w:color="D0D7DE" w:sz="1"/>
+              <w:left w:val="single" w:color="D0D7DE" w:sz="1"/>
+              <w:bottom w:val="single" w:color="D0D7DE" w:sz="1"/>
+              <w:right w:val="single" w:color="D0D7DE" w:sz="1"/>
+            </w:tcBorders>
+            <w:shd w:fill="FFFFFF" w:val="clear"/>
+            <w:tcMar>
+              <w:top w:type="dxa" w:w="80"/>
+              <w:left w:type="dxa" w:w="120"/>
+              <w:bottom w:type="dxa" w:w="80"/>
+              <w:right w:type="dxa" w:w="120"/>
+            </w:tcMar>
+          </w:tcPr>
+          <w:p>
+            <w:r>
+              <w:rPr>
+                <w:rFonts w:ascii="Arial" w:cs="Arial" w:eastAsia="Arial" w:hAnsi="Arial"/>
+                <w:sz w:val="18"/>
+                <w:szCs w:val="18"/>
+              </w:rPr>
+              <w:t xml:space="preserve">data_sources: reliability_score (0–100), degrades on failures</w:t>
+            </w:r>
+          </w:p>
+        </w:tc>
+      </w:tr>
+      <w:tr>
+        <w:tc>
+          <w:tcPr>
+            <w:tcW w:type="dxa" w:w="3600"/>
+            <w:tcBorders>
+              <w:top w:val="single" w:color="D0D7DE" w:sz="1"/>
+              <w:left w:val="single" w:color="D0D7DE" w:sz="1"/>
+              <w:bottom w:val="single" w:color="D0D7DE" w:sz="1"/>
+              <w:right w:val="single" w:color="D0D7DE" w:sz="1"/>
+            </w:tcBorders>
+            <w:shd w:fill="F6F8FA" w:val="clear"/>
+            <w:tcMar>
+              <w:top w:type="dxa" w:w="80"/>
+              <w:left w:type="dxa" w:w="120"/>
+              <w:bottom w:type="dxa" w:w="80"/>
+              <w:right w:type="dxa" w:w="120"/>
+            </w:tcMar>
+          </w:tcPr>
+          <w:p>
+            <w:r>
+              <w:rPr>
+                <w:rFonts w:ascii="Arial" w:cs="Arial" w:eastAsia="Arial" w:hAnsi="Arial"/>
+                <w:sz w:val="18"/>
+                <w:szCs w:val="18"/>
+              </w:rPr>
+              <w:t xml:space="preserve">Dependency map (which flows use this)</w:t>
+            </w:r>
+          </w:p>
+        </w:tc>
+        <w:tc>
+          <w:tcPr>
+            <w:tcW w:type="dxa" w:w="2200"/>
+            <w:tcBorders>
+              <w:top w:val="none" w:color="FFFFFF" w:sz="0"/>
+              <w:left w:val="none" w:color="FFFFFF" w:sz="0"/>
+              <w:bottom w:val="none" w:color="FFFFFF" w:sz="0"/>
+              <w:right w:val="none" w:color="FFFFFF" w:sz="0"/>
+            </w:tcBorders>
+            <w:shd w:fill="E65100" w:val="clear"/>
+            <w:tcMar>
+              <w:top w:type="dxa" w:w="80"/>
+              <w:left w:type="dxa" w:w="180"/>
+              <w:bottom w:type="dxa" w:w="80"/>
+              <w:right w:type="dxa" w:w="180"/>
+            </w:tcMar>
+            <w:vAlign w:val="center"/>
+          </w:tcPr>
+          <w:p>
+            <w:pPr>
+              <w:jc w:val="center"/>
+            </w:pPr>
+            <w:r>
+              <w:rPr>
+                <w:rFonts w:ascii="Arial" w:cs="Arial" w:eastAsia="Arial" w:hAnsi="Arial"/>
+                <w:b/>
+                <w:bCs/>
+                <w:color w:val="FFFFFF"/>
+                <w:sz w:val="16"/>
+                <w:szCs w:val="16"/>
+              </w:rPr>
               <w:t xml:space="preserve">ADAPTED TRANSLATION</w:t>
             </w:r>
           </w:p>
@@ -4732,6 +4825,36 @@
               <w:bottom w:val="single" w:color="D0D7DE" w:sz="1"/>
               <w:right w:val="single" w:color="D0D7DE" w:sz="1"/>
             </w:tcBorders>
+            <w:shd w:fill="F6F8FA" w:val="clear"/>
+            <w:tcMar>
+              <w:top w:type="dxa" w:w="80"/>
+              <w:left w:type="dxa" w:w="120"/>
+              <w:bottom w:type="dxa" w:w="80"/>
+              <w:right w:type="dxa" w:w="120"/>
+            </w:tcMar>
+          </w:tcPr>
+          <w:p>
+            <w:r>
+              <w:rPr>
+                <w:rFonts w:ascii="Arial" w:cs="Arial" w:eastAsia="Arial" w:hAnsi="Arial"/>
+                <w:sz w:val="18"/>
+                <w:szCs w:val="18"/>
+              </w:rPr>
+              <w:t xml:space="preserve">platform.ecosystem_dependencies links ecosystems to their data sources</w:t>
+            </w:r>
+          </w:p>
+        </w:tc>
+      </w:tr>
+      <w:tr>
+        <w:tc>
+          <w:tcPr>
+            <w:tcW w:type="dxa" w:w="3600"/>
+            <w:tcBorders>
+              <w:top w:val="single" w:color="D0D7DE" w:sz="1"/>
+              <w:left w:val="single" w:color="D0D7DE" w:sz="1"/>
+              <w:bottom w:val="single" w:color="D0D7DE" w:sz="1"/>
+              <w:right w:val="single" w:color="D0D7DE" w:sz="1"/>
+            </w:tcBorders>
             <w:shd w:fill="FFFFFF" w:val="clear"/>
             <w:tcMar>
               <w:top w:type="dxa" w:w="80"/>
@@ -4747,7 +4870,70 @@
                 <w:sz w:val="18"/>
                 <w:szCs w:val="18"/>
               </w:rPr>
-              <w:t xml:space="preserve">ecosystem_dependencies JSONB — which E## uses it</w:t>
+              <w:t xml:space="preserve">Compliance / security status</w:t>
+            </w:r>
+          </w:p>
+        </w:tc>
+        <w:tc>
+          <w:tcPr>
+            <w:tcW w:type="dxa" w:w="2200"/>
+            <w:tcBorders>
+              <w:top w:val="none" w:color="FFFFFF" w:sz="0"/>
+              <w:left w:val="none" w:color="FFFFFF" w:sz="0"/>
+              <w:bottom w:val="none" w:color="FFFFFF" w:sz="0"/>
+              <w:right w:val="none" w:color="FFFFFF" w:sz="0"/>
+            </w:tcBorders>
+            <w:shd w:fill="1B3A6B" w:val="clear"/>
+            <w:tcMar>
+              <w:top w:type="dxa" w:w="80"/>
+              <w:left w:type="dxa" w:w="180"/>
+              <w:bottom w:type="dxa" w:w="80"/>
+              <w:right w:type="dxa" w:w="180"/>
+            </w:tcMar>
+            <w:vAlign w:val="center"/>
+          </w:tcPr>
+          <w:p>
+            <w:pPr>
+              <w:jc w:val="center"/>
+            </w:pPr>
+            <w:r>
+              <w:rPr>
+                <w:rFonts w:ascii="Arial" w:cs="Arial" w:eastAsia="Arial" w:hAnsi="Arial"/>
+                <w:b/>
+                <w:bCs/>
+                <w:color w:val="FFFFFF"/>
+                <w:sz w:val="16"/>
+                <w:szCs w:val="16"/>
+              </w:rPr>
+              <w:t xml:space="preserve">DIRECT TRANSLATION</w:t>
+            </w:r>
+          </w:p>
+        </w:tc>
+        <w:tc>
+          <w:tcPr>
+            <w:tcW w:type="dxa" w:w="3560"/>
+            <w:tcBorders>
+              <w:top w:val="single" w:color="D0D7DE" w:sz="1"/>
+              <w:left w:val="single" w:color="D0D7DE" w:sz="1"/>
+              <w:bottom w:val="single" w:color="D0D7DE" w:sz="1"/>
+              <w:right w:val="single" w:color="D0D7DE" w:sz="1"/>
+            </w:tcBorders>
+            <w:shd w:fill="FFFFFF" w:val="clear"/>
+            <w:tcMar>
+              <w:top w:type="dxa" w:w="80"/>
+              <w:left w:type="dxa" w:w="120"/>
+              <w:bottom w:type="dxa" w:w="80"/>
+              <w:right w:type="dxa" w:w="120"/>
+            </w:tcMar>
+          </w:tcPr>
+          <w:p>
+            <w:r>
+              <w:rPr>
+                <w:rFonts w:ascii="Arial" w:cs="Arial" w:eastAsia="Arial" w:hAnsi="Arial"/>
+                <w:sz w:val="18"/>
+                <w:szCs w:val="18"/>
+              </w:rPr>
+              <w:t xml:space="preserve">data_sources: compliance_status (pending/approved/restricted/revoked)</w:t>
             </w:r>
           </w:p>
         </w:tc>
@@ -4781,7 +4967,7 @@
                 <w:sz w:val="17"/>
                 <w:szCs w:val="17"/>
               </w:rPr>
-              <w:t xml:space="preserve">-- BGOP Integration Credentials: proposed schema</w:t>
+              <w:t xml:space="preserve">-- pipeline.data_sources IS the Connection Reference table (already deployed)</w:t>
             </w:r>
           </w:p>
           <w:p>
@@ -4795,7 +4981,7 @@
                 <w:sz w:val="17"/>
                 <w:szCs w:val="17"/>
               </w:rPr>
-              <w:t xml:space="preserve">CREATE TABLE bgop_integration_credentials (</w:t>
+              <w:t xml:space="preserve">-- The vault: pattern for credentials is already the standard:</w:t>
             </w:r>
           </w:p>
           <w:p>
@@ -4809,7 +4995,7 @@
                 <w:sz w:val="17"/>
                 <w:szCs w:val="17"/>
               </w:rPr>
-              <w:t xml:space="preserve">  id              UUID DEFAULT gen_random_uuid() PRIMARY KEY,</w:t>
+              <w:t xml:space="preserve">UPDATE pipeline.data_sources</w:t>
             </w:r>
           </w:p>
           <w:p>
@@ -4823,7 +5009,7 @@
                 <w:sz w:val="17"/>
                 <w:szCs w:val="17"/>
               </w:rPr>
-              <w:t xml:space="preserve">  integration_name TEXT NOT NULL UNIQUE,  -- 'ngpvan', 'sendgrid', 'twilio'</w:t>
+              <w:t xml:space="preserve">SET connection_config = jsonb_set(</w:t>
             </w:r>
           </w:p>
           <w:p>
@@ -4837,7 +5023,7 @@
                 <w:sz w:val="17"/>
                 <w:szCs w:val="17"/>
               </w:rPr>
-              <w:t xml:space="preserve">  integration_type TEXT,                  -- 'crm', 'email', 'sms', 'payment'</w:t>
+              <w:t xml:space="preserve">  connection_config,</w:t>
             </w:r>
           </w:p>
           <w:p>
@@ -4851,7 +5037,7 @@
                 <w:sz w:val="17"/>
                 <w:szCs w:val="17"/>
               </w:rPr>
-              <w:t xml:space="preserve">  environment     TEXT NOT NULL,</w:t>
+              <w:t xml:space="preserve">  '{api_key_ref}',</w:t>
             </w:r>
           </w:p>
           <w:p>
@@ -4865,7 +5051,7 @@
                 <w:sz w:val="17"/>
                 <w:szCs w:val="17"/>
               </w:rPr>
-              <w:t xml:space="preserve">  api_key         TEXT,  -- stored encrypted via pg_crypto</w:t>
+              <w:t xml:space="preserve">  '"vault:sendgrid_api_key_prod"'</w:t>
             </w:r>
           </w:p>
           <w:p>
@@ -4879,7 +5065,7 @@
                 <w:sz w:val="17"/>
                 <w:szCs w:val="17"/>
               </w:rPr>
-              <w:t xml:space="preserve">  api_secret      TEXT,</w:t>
+              <w:t xml:space="preserve">)</w:t>
             </w:r>
           </w:p>
           <w:p>
@@ -4893,7 +5079,7 @@
                 <w:sz w:val="17"/>
                 <w:szCs w:val="17"/>
               </w:rPr>
-              <w:t xml:space="preserve">  base_url        TEXT,</w:t>
+              <w:t xml:space="preserve">WHERE source_name = 'SendGrid';</w:t>
             </w:r>
           </w:p>
           <w:p>
@@ -4907,7 +5093,7 @@
                 <w:sz w:val="17"/>
                 <w:szCs w:val="17"/>
               </w:rPr>
-              <w:t xml:space="preserve">  service_account TEXT,</w:t>
+              <w:t xml:space="preserve"/>
             </w:r>
           </w:p>
           <w:p>
@@ -4921,7 +5107,7 @@
                 <w:sz w:val="17"/>
                 <w:szCs w:val="17"/>
               </w:rPr>
-              <w:t xml:space="preserve">  rotated_at      TIMESTAMPTZ,</w:t>
+              <w:t xml:space="preserve">-- Gap to close: back vault: references with actual pgcrypto storage</w:t>
             </w:r>
           </w:p>
           <w:p>
@@ -4935,7 +5121,7 @@
                 <w:sz w:val="17"/>
                 <w:szCs w:val="17"/>
               </w:rPr>
-              <w:t xml:space="preserve">  expires_at      TIMESTAMPTZ,</w:t>
+              <w:t xml:space="preserve">-- Add a credentials_vault table where vault: keys resolve to encrypted values:</w:t>
             </w:r>
           </w:p>
           <w:p>
@@ -4949,7 +5135,63 @@
                 <w:sz w:val="17"/>
                 <w:szCs w:val="17"/>
               </w:rPr>
-              <w:t xml:space="preserve">  ecosystem_deps  JSONB  -- ['E30', 'E31']</w:t>
+              <w:t xml:space="preserve">CREATE TABLE pipeline.credentials_vault (</w:t>
+            </w:r>
+          </w:p>
+          <w:p>
+            <w:pPr>
+              <w:spacing w:after="0" w:before="0"/>
+            </w:pPr>
+            <w:r>
+              <w:rPr>
+                <w:rFonts w:ascii="Courier New" w:cs="Courier New" w:eastAsia="Courier New" w:hAnsi="Courier New"/>
+                <w:color w:val="A5D6FF"/>
+                <w:sz w:val="17"/>
+                <w:szCs w:val="17"/>
+              </w:rPr>
+              <w:t xml:space="preserve">  vault_key    TEXT PRIMARY KEY,  -- e.g. 'sendgrid_api_key_prod'</w:t>
+            </w:r>
+          </w:p>
+          <w:p>
+            <w:pPr>
+              <w:spacing w:after="0" w:before="0"/>
+            </w:pPr>
+            <w:r>
+              <w:rPr>
+                <w:rFonts w:ascii="Courier New" w:cs="Courier New" w:eastAsia="Courier New" w:hAnsi="Courier New"/>
+                <w:color w:val="A5D6FF"/>
+                <w:sz w:val="17"/>
+                <w:szCs w:val="17"/>
+              </w:rPr>
+              <w:t xml:space="preserve">  secret_value TEXT NOT NULL,     -- pgcrypto encrypted</w:t>
+            </w:r>
+          </w:p>
+          <w:p>
+            <w:pPr>
+              <w:spacing w:after="0" w:before="0"/>
+            </w:pPr>
+            <w:r>
+              <w:rPr>
+                <w:rFonts w:ascii="Courier New" w:cs="Courier New" w:eastAsia="Courier New" w:hAnsi="Courier New"/>
+                <w:color w:val="A5D6FF"/>
+                <w:sz w:val="17"/>
+                <w:szCs w:val="17"/>
+              </w:rPr>
+              <w:t xml:space="preserve">  rotated_at   TIMESTAMPTZ DEFAULT now(),</w:t>
+            </w:r>
+          </w:p>
+          <w:p>
+            <w:pPr>
+              <w:spacing w:after="0" w:before="0"/>
+            </w:pPr>
+            <w:r>
+              <w:rPr>
+                <w:rFonts w:ascii="Courier New" w:cs="Courier New" w:eastAsia="Courier New" w:hAnsi="Courier New"/>
+                <w:color w:val="A5D6FF"/>
+                <w:sz w:val="17"/>
+                <w:szCs w:val="17"/>
+              </w:rPr>
+              <w:t xml:space="preserve">  expires_at   TIMESTAMPTZ</w:t>
             </w:r>
           </w:p>
           <w:p>
@@ -5006,7 +5248,7 @@
                 <w:sz w:val="18"/>
                 <w:szCs w:val="18"/>
               </w:rPr>
-              <w:t xml:space="preserve">When your SendGrid API key expires at 2am before a mail drop, you do not want to be SSH'd into a Python file doing a commit. One row update, immediate effect. This is credential management maturity that D365 has had since 2016.</w:t>
+              <w:t xml:space="preserve">The Connection Reference pattern is already designed into pipeline.data_sources with the vault: reference convention. The gap is thin: add pipeline.credentials_vault to back those references with actual pgcrypto-encrypted values. One table, ~20 rows, closes the credential management gap permanently. When SendGrid rotates at 2am before a mail drop, it is one UPDATE.</w:t>
             </w:r>
           </w:p>
         </w:tc>
@@ -5365,7 +5607,7 @@
                 <w:sz w:val="18"/>
                 <w:szCs w:val="18"/>
               </w:rPr>
-              <w:t xml:space="preserve">BGOP already has deduplication logic in the person_spine pipeline, but it is pipeline-time only, not entry-time. The adaptation: build a dedup_rules table configuring which field combinations trigger a pre-insert identity check. At entry time, the API calls match_person() before INSERT. The political context adds complexity: same person can be donor in one state and volunteer in another.</w:t>
+              <w:t xml:space="preserve">BGOP already has deduplication logic in the donor_intelligence.person_master pipeline, but it is pipeline-time only, not entry-time. The adaptation: build a dedup_rules table configuring which field combinations trigger a pre-insert identity check. At entry time, the API calls match_person() before INSERT. The political context adds complexity: same person can be donor in one state and volunteer in another.</w:t>
             </w:r>
           </w:p>
         </w:tc>
@@ -5929,7 +6171,7 @@
                 <w:sz w:val="18"/>
                 <w:szCs w:val="18"/>
               </w:rPr>
-              <w:t xml:space="preserve">dedup_sweep_job in Supabase pg_cron</w:t>
+              <w:t xml:space="preserve">dedup_sweep_job in pg_cron extension (Hetzner PG16)</w:t>
             </w:r>
           </w:p>
         </w:tc>
@@ -6208,7 +6450,7 @@
                 <w:sz w:val="18"/>
                 <w:szCs w:val="18"/>
               </w:rPr>
-              <w:t xml:space="preserve">Cross-spine: person_spine vs. donor_raw dedup</w:t>
+              <w:t xml:space="preserve">Cross-spine: donor_intelligence.person_master vs. donor_raw dedup</w:t>
             </w:r>
           </w:p>
         </w:tc>
@@ -6397,7 +6639,7 @@
                 <w:sz w:val="18"/>
                 <w:szCs w:val="18"/>
               </w:rPr>
-              <w:t xml:space="preserve">D365 blocks duplicate creation at the UI layer. BGOP has deduplication post-hoc. The gap is entry-time prevention — blocking a bad insert before it contaminates the golden record. This is critical because DataTrust feed introduces 60M+ records that must resolve against person_spine cleanly.</w:t>
+              <w:t xml:space="preserve">D365 blocks duplicate creation at the UI layer. BGOP has deduplication post-hoc. The gap is entry-time prevention — blocking a bad insert before it contaminates the golden record. This is critical because DataTrust feed introduces 60M+ records that must resolve against donor_intelligence.person_master cleanly.</w:t>
             </w:r>
           </w:p>
         </w:tc>
@@ -9140,7 +9382,7 @@
                 <w:sz w:val="17"/>
                 <w:szCs w:val="17"/>
               </w:rPr>
-              <w:t xml:space="preserve">-- Fires when inbound donation webhook fails person_spine identity match</w:t>
+              <w:t xml:space="preserve">-- Fires when inbound donation webhook fails donor_intelligence.person_master identity match</w:t>
             </w:r>
           </w:p>
           <w:p>
@@ -9421,7 +9663,7 @@
                 <w:sz w:val="18"/>
                 <w:szCs w:val="18"/>
               </w:rPr>
-              <w:t xml:space="preserve">The critical distinction: BGOP is a campaign data and operations platform, not a payment processor. WinRed and Anedot own the financial compliance obligation for large-donor reporting. BGOP's compliance obligation is data integrity — ensuring every webhook donation record resolves cleanly to the correct person_spine identity under the correct candidate silo, and that the quarterly FEC filing accurately reflects what those processors reported.</w:t>
+              <w:t xml:space="preserve">The critical distinction: BGOP is a campaign data and operations platform, not a payment processor. WinRed and Anedot own the financial compliance obligation for large-donor reporting. BGOP's compliance obligation is data integrity — ensuring every webhook donation record resolves cleanly to the correct donor_intelligence.person_master identity under the correct candidate silo, and that the quarterly FEC filing accurately reflects what those processors reported.</w:t>
             </w:r>
           </w:p>
         </w:tc>
@@ -10246,7 +10488,7 @@
                 <w:sz w:val="18"/>
                 <w:szCs w:val="18"/>
               </w:rPr>
-              <w:t xml:space="preserve">on_enter webhook: fire Supabase Edge Function</w:t>
+              <w:t xml:space="preserve">on_enter webhook: Python worker on Hetzner (relay.py stack)</w:t>
             </w:r>
           </w:p>
         </w:tc>
@@ -10680,7 +10922,7 @@
                 <w:sz w:val="17"/>
                 <w:szCs w:val="17"/>
               </w:rPr>
-              <w:t xml:space="preserve">-- Stage 2: Data Foundation      → DataTrust import complete, person_spine seeded</w:t>
+              <w:t xml:space="preserve">-- Stage 2: Data Foundation      → DataTrust import complete, donor_intelligence.person_master seeded</w:t>
             </w:r>
           </w:p>
           <w:p>
@@ -11138,7 +11380,7 @@
                 <w:sz w:val="18"/>
                 <w:szCs w:val="18"/>
               </w:rPr>
-              <w:t xml:space="preserve">BGOP requires 8 roles. Each role gets explicit CRUD grants per Supabase table via Row-Level Security policies. The many-to-many architecture means a person (Eddie) can be a Platform Admin for all candidates and simultaneously operate as a Candidate-level observer for read-only reporting. Roles are JWT-claim-based, evaluated at query time by RLS policies.</w:t>
+              <w:t xml:space="preserve">BGOP requires 8 roles. Each role gets explicit CRUD grants via Row-Level Security policies. The many-to-many architecture means a person (Eddie) can be a Platform Admin for all candidates and simultaneously operate as a Candidate-level observer for read-only reporting. Roles are JWT-claim-based, evaluated at query time by RLS policies.</w:t>
             </w:r>
           </w:p>
         </w:tc>
@@ -11516,7 +11758,7 @@
                 <w:sz w:val="18"/>
                 <w:szCs w:val="18"/>
               </w:rPr>
-              <w:t xml:space="preserve">Supabase RLS: USING (role = 'admin') per table</w:t>
+              <w:t xml:space="preserve">PostgreSQL RLS (Hetzner PG16): USING (role = 'admin') per table</w:t>
             </w:r>
           </w:p>
         </w:tc>
@@ -14600,7 +14842,7 @@
                 <w:sz w:val="18"/>
                 <w:szCs w:val="18"/>
               </w:rPr>
-              <w:t xml:space="preserve">last_contact_date, channel_history JSONB on person_spine</w:t>
+              <w:t xml:space="preserve">last_contact_date, channel_history JSONB on donor_intelligence.person_master</w:t>
             </w:r>
           </w:p>
         </w:tc>
@@ -15790,7 +16032,7 @@
                 <w:sz w:val="18"/>
                 <w:szCs w:val="18"/>
               </w:rPr>
-              <w:t xml:space="preserve">When Candidate A's campaign manager edits the person_spine schema to add a field for their use case, and that breaks Candidate B's pipeline — you have a managed properties problem. The is_locked flag on ecosystem_registry prevents any candidate-level operator from touching platform-core table definitions. Required before multi-tenant candidate deployment.</w:t>
+              <w:t xml:space="preserve">When Candidate A's campaign manager edits the donor_intelligence.person_master schema to add a field for their use case, and that breaks Candidate B's pipeline — you have a managed properties problem. The is_locked flag on ecosystem_registry prevents any candidate-level operator from touching platform-core table definitions. Required before multi-tenant candidate deployment.</w:t>
             </w:r>
           </w:p>
         </w:tc>
@@ -18887,7 +19129,7 @@
                 <w:sz w:val="17"/>
                 <w:szCs w:val="17"/>
               </w:rPr>
-              <w:t xml:space="preserve">  training_table  TEXT,                  -- 'person_spine'</w:t>
+              <w:t xml:space="preserve">  training_table  TEXT,                  -- 'donor_intelligence.person_master'</w:t>
             </w:r>
           </w:p>
           <w:p>
@@ -19382,7 +19624,7 @@
                 <w:sz w:val="18"/>
                 <w:szCs w:val="18"/>
               </w:rPr>
-              <w:t xml:space="preserve">BroyhillGOP already has the right instinct — 59 ecosystems are themselves modules. The gap is formalization: a standard plugin contract so new ecosystems drop in without touching existing ones. BGOP's plugin mechanism is: Supabase Edge Functions (event handlers), ecosystem_registry (app manifest), DEPLOY_*.py files (installer scripts), and a new bgop_plugin_manifest table that defines what each ecosystem exposes, what events it subscribes to, what tables it owns, and what API endpoints it publishes. The political context means new 'apps' are campaign capabilities: a new state's voter file, a new polling integration, a new direct mail vendor — all installable via manifest + deploy.</w:t>
+              <w:t xml:space="preserve">ALREADY DEPLOYED: The platform schema on Hetzner PG16 IS the plugin manifest — 8 tables covering platform.ecosystems (60 ecosystems, E00-E60, versioned), platform.ecosystem_features (individual features per ecosystem, the unit that gets added or deprecated), platform.ecosystem_versions (full changelog per revision), platform.candidate_ecosystems (per-candidate activation with feature overrides), platform.candidate_feature_config (granular per-candidate per-feature settings), platform.ecosystem_dependencies (dependency graph), platform.ecosystem_health (real-time monitoring), and platform.universes (7 universe groups: DATA, COMMS, MEDIA, OPS, INTEL, PORTAL, INFRA). The event plumbing: relay.py (FastAPI, port 8080) receives webhooks → publishes to Redis bgop:events channel → brain.event_queue (PG, partitioned) holds durable queue. The brain worker that subscribes to Redis and drains the queue is the remaining gap.</w:t>
             </w:r>
           </w:p>
         </w:tc>
@@ -19667,7 +19909,7 @@
                 <w:sz w:val="18"/>
                 <w:szCs w:val="18"/>
               </w:rPr>
-              <w:t xml:space="preserve">Supabase triggers + Edge Functions subscribe to table events (INSERT/UPDATE/DELETE)</w:t>
+              <w:t xml:space="preserve">Postgres triggers (Hetzner PG16) + relay.py webhook receiver (port 8080)</w:t>
             </w:r>
           </w:p>
         </w:tc>
@@ -19853,7 +20095,7 @@
                 <w:sz w:val="18"/>
                 <w:szCs w:val="18"/>
               </w:rPr>
-              <w:t xml:space="preserve">Supabase Edge Function via pg_notify / webhook: downstream processing after commit</w:t>
+              <w:t xml:space="preserve">Redis pub/sub → brain.event_queue consumer: downstream processing after commit</w:t>
             </w:r>
           </w:p>
         </w:tc>
@@ -20504,7 +20746,7 @@
                 <w:sz w:val="18"/>
                 <w:szCs w:val="18"/>
               </w:rPr>
-              <w:t xml:space="preserve">pg_notify + Supabase Realtime as async event bus for ecosystem-to-ecosystem events</w:t>
+              <w:t xml:space="preserve">Redis pub/sub (bgop:events channel) → brain.event_queue as async event bus</w:t>
             </w:r>
           </w:p>
         </w:tc>
@@ -20822,7 +21064,7 @@
                 <w:sz w:val="17"/>
                 <w:szCs w:val="17"/>
               </w:rPr>
-              <w:t xml:space="preserve">  subscribed_events  JSONB,    -- [{table:'person_spine',op:'INSERT',fn:'e30_welcome'}]</w:t>
+              <w:t xml:space="preserve">  subscribed_events  JSONB,    -- [{table:'donor_intelligence.person_master',op:'INSERT',fn:'e30_welcome'}]</w:t>
             </w:r>
           </w:p>
           <w:p>
@@ -21047,7 +21289,7 @@
                 <w:sz w:val="18"/>
                 <w:szCs w:val="18"/>
               </w:rPr>
-              <w:t xml:space="preserve">This is the architectural move that transforms BroyhillGOP from a monolith into a platform. Right now, activating a new ecosystem means tribal knowledge, manual steps, and prayer. With bgop_plugin_manifest, every ecosystem is a self-describing installable unit: it declares what it owns, what it listens to, what it needs, and what order it requires. A new campaign adds their polling vendor integration the same way they add any other ecosystem — one manifest row, one DEPLOY script, one activation toggle. That is what D365 AppSource does. That is what BGOP must replicate.</w:t>
+              <w:t xml:space="preserve">The platform schema is already deployed on Hetzner with all 8 tables and 60 ecosystems registered. The plumbing is laid: relay.py receives the webhook, Redis carries the signal, brain.event_queue holds the durable record. The one missing piece is the brain worker — the Python process that subscribes to the Redis bgop:events channel, evaluates the event through the trigger engine, and drains brain.event_queue. Without it, events arrive but nothing processes them. That worker is the last step between a platform with installed infrastructure and a platform that actually runs. Everything D365 AppSource does for installable modules, platform.ecosystems already does.</w:t>
             </w:r>
           </w:p>
         </w:tc>
@@ -21401,7 +21643,7 @@
                 <w:sz w:val="18"/>
                 <w:szCs w:val="18"/>
               </w:rPr>
-              <w:t xml:space="preserve">BroyhillGOP deliberately does NOT own the payment processing relationship. Each candidate has their own WinRed or Anedot account and existing merchant subscription. BGOP is granted co-admin access to each candidate's processor account. Donations are processed entirely within the candidate's processor environment. BGOP receives transaction data via webhook after settlement, codes each transaction with the candidate's campaign attribution identifiers, writes the resolved record to the person_spine, and generates quarterly FEC and NCGOP reports. This architecture eliminates PCI DSS scope for BGOP entirely and keeps financial liability where it belongs — with the candidate's campaign committee.</w:t>
+              <w:t xml:space="preserve">BGOP does NOT own the payment processing relationship. Each candidate has their own WinRed or Anedot account. BGOP is granted co-admin access and receives transaction data via webhook after settlement. The actual data flow on Hetzner: WinRed/Anedot POST to relay.py (port 8080) → HMAC verification → Redis pub/sub (bgop:events) → brain.event_queue (durable PG record) → Python brain worker processes event → pipeline.inbound_data_queue (data_type='donation') → processing pipeline resolves identity against donor_intelligence.person_master → donor_intelligence.contribution_map (the final junction record linking every transaction to one person_master row). No standalone donations table — the existing pipeline IS the donation ingestion architecture. Zero PCI scope for BGOP.</w:t>
             </w:r>
           </w:p>
         </w:tc>
@@ -21872,7 +22114,7 @@
                 <w:sz w:val="18"/>
                 <w:szCs w:val="18"/>
               </w:rPr>
-              <w:t xml:space="preserve">processor_access table: candidate_id, processor ('winred'/'anedot'), co_admin_email, access_level</w:t>
+              <w:t xml:space="preserve">pipeline.data_sources row per processor per candidate; connection_config holds vault:webhook_secret</w:t>
             </w:r>
           </w:p>
         </w:tc>
@@ -21965,7 +22207,7 @@
                 <w:sz w:val="18"/>
                 <w:szCs w:val="18"/>
               </w:rPr>
-              <w:t xml:space="preserve">campaign_codes table: candidate_id, code, description, processor, active — codes transaction source</w:t>
+              <w:t xml:space="preserve">campaign_codes table (new): candidate_id, processor, code, channel — attribute each transaction</w:t>
             </w:r>
           </w:p>
         </w:tc>
@@ -22058,7 +22300,7 @@
                 <w:sz w:val="18"/>
                 <w:szCs w:val="18"/>
               </w:rPr>
-              <w:t xml:space="preserve">POST /webhooks/winred and /webhooks/anedot — receive settled transaction payload</w:t>
+              <w:t xml:space="preserve">relay.py POST /event → Redis bgop:events → brain.event_queue (partitioned PG table)</w:t>
             </w:r>
           </w:p>
         </w:tc>
@@ -22151,7 +22393,7 @@
                 <w:sz w:val="18"/>
                 <w:szCs w:val="18"/>
               </w:rPr>
-              <w:t xml:space="preserve">HMAC-SHA256 signature check on every inbound webhook before processing</w:t>
+              <w:t xml:space="preserve">HMAC-SHA256 in relay.py before Redis publish; secret from pipeline.data_sources vault ref</w:t>
             </w:r>
           </w:p>
         </w:tc>
@@ -22244,7 +22486,7 @@
                 <w:sz w:val="18"/>
                 <w:szCs w:val="18"/>
               </w:rPr>
-              <w:t xml:space="preserve">Webhook donor fields → match_person() → resolve to person_spine (or queue if ambiguous)</w:t>
+              <w:t xml:space="preserve">pipeline.inbound_data_queue → processing worker → match against donor_intelligence.person_master</w:t>
             </w:r>
           </w:p>
         </w:tc>
@@ -22337,7 +22579,7 @@
                 <w:sz w:val="18"/>
                 <w:szCs w:val="18"/>
               </w:rPr>
-              <w:t xml:space="preserve">processor_transaction_id UNIQUE constraint prevents duplicate webhook replays</w:t>
+              <w:t xml:space="preserve">pipeline.inbound_data_queue source_record_id UNIQUE index prevents duplicate webhook replays</w:t>
             </w:r>
           </w:p>
         </w:tc>
@@ -22367,7 +22609,7 @@
                 <w:sz w:val="18"/>
                 <w:szCs w:val="18"/>
               </w:rPr>
-              <w:t xml:space="preserve">Refund / chargeback reconciliation</w:t>
+              <w:t xml:space="preserve">Final attribution record</w:t>
             </w:r>
           </w:p>
         </w:tc>
@@ -22430,7 +22672,7 @@
                 <w:sz w:val="18"/>
                 <w:szCs w:val="18"/>
               </w:rPr>
-              <w:t xml:space="preserve">Processor sends refund webhook → mark donation record voided + flag for FEC correction</w:t>
+              <w:t xml:space="preserve">donor_intelligence.contribution_map: (person_id, source_system='winred', source_row_id, amount)</w:t>
             </w:r>
           </w:p>
         </w:tc>
@@ -22460,7 +22702,7 @@
                 <w:sz w:val="18"/>
                 <w:szCs w:val="18"/>
               </w:rPr>
-              <w:t xml:space="preserve">Multi-processor per candidate</w:t>
+              <w:t xml:space="preserve">Refund / chargeback reconciliation</w:t>
             </w:r>
           </w:p>
         </w:tc>
@@ -22473,7 +22715,7 @@
               <w:bottom w:val="none" w:color="FFFFFF" w:sz="0"/>
               <w:right w:val="none" w:color="FFFFFF" w:sz="0"/>
             </w:tcBorders>
-            <w:shd w:fill="1B3A6B" w:val="clear"/>
+            <w:shd w:fill="E65100" w:val="clear"/>
             <w:tcMar>
               <w:top w:type="dxa" w:w="80"/>
               <w:left w:type="dxa" w:w="180"/>
@@ -22495,7 +22737,7 @@
                 <w:sz w:val="16"/>
                 <w:szCs w:val="16"/>
               </w:rPr>
-              <w:t xml:space="preserve">DIRECT TRANSLATION</w:t>
+              <w:t xml:space="preserve">ADAPTED TRANSLATION</w:t>
             </w:r>
           </w:p>
         </w:tc>
@@ -22523,7 +22765,7 @@
                 <w:sz w:val="18"/>
                 <w:szCs w:val="18"/>
               </w:rPr>
-              <w:t xml:space="preserve">One candidate can have both WinRed AND Anedot rows in processor_access table</w:t>
+              <w:t xml:space="preserve">Refund webhook → pipeline.inbound_data_queue (data_type='donation_refund') → void contribution_map row</w:t>
             </w:r>
           </w:p>
         </w:tc>
@@ -22553,7 +22795,7 @@
                 <w:sz w:val="18"/>
                 <w:szCs w:val="18"/>
               </w:rPr>
-              <w:t xml:space="preserve">Candidate silo isolation</w:t>
+              <w:t xml:space="preserve">Multi-processor per candidate</w:t>
             </w:r>
           </w:p>
         </w:tc>
@@ -22616,7 +22858,7 @@
                 <w:sz w:val="18"/>
                 <w:szCs w:val="18"/>
               </w:rPr>
-              <w:t xml:space="preserve">candidate_id on every donation record; cross-candidate queries blocked by RLS</w:t>
+              <w:t xml:space="preserve">One candidate can have both WinRed AND Anedot rows in pipeline.data_sources</w:t>
             </w:r>
           </w:p>
         </w:tc>
@@ -22709,7 +22951,7 @@
                 <w:sz w:val="18"/>
                 <w:szCs w:val="18"/>
               </w:rPr>
-              <w:t xml:space="preserve">generate_fec_report(candidate_id, quarter) → FEC-format CSV from BGOP donation records</w:t>
+              <w:t xml:space="preserve">generate_fec_report(candidate_id, quarter) → queries contribution_map + person_master</w:t>
             </w:r>
           </w:p>
         </w:tc>
@@ -22802,7 +23044,7 @@
                 <w:sz w:val="18"/>
                 <w:szCs w:val="18"/>
               </w:rPr>
-              <w:t xml:space="preserve">generate_ncgop_integrity_log(candidate_id, quarter) → anomaly log, resolutions, counts</w:t>
+              <w:t xml:space="preserve">generate_ncgop_integrity_log(candidate_id, quarter) → pipeline.candidate_enrichment_log anomalies</w:t>
             </w:r>
           </w:p>
         </w:tc>
@@ -22836,7 +23078,7 @@
                 <w:sz w:val="17"/>
                 <w:szCs w:val="17"/>
               </w:rPr>
-              <w:t xml:space="preserve">-- BGOP Processor Integration Schema</w:t>
+              <w:t xml:space="preserve">-- WinRed/Anedot donation flow on Hetzner (actual pipeline)</w:t>
             </w:r>
           </w:p>
           <w:p>
@@ -22864,7 +23106,7 @@
                 <w:sz w:val="17"/>
                 <w:szCs w:val="17"/>
               </w:rPr>
-              <w:t xml:space="preserve">-- Co-admin access registry</w:t>
+              <w:t xml:space="preserve">-- Step 1: relay.py receives webhook, verifies HMAC, publishes to Redis</w:t>
             </w:r>
           </w:p>
           <w:p>
@@ -22878,7 +23120,7 @@
                 <w:sz w:val="17"/>
                 <w:szCs w:val="17"/>
               </w:rPr>
-              <w:t xml:space="preserve">CREATE TABLE processor_access (</w:t>
+              <w:t xml:space="preserve">-- r.publish('bgop:events', json.dumps({type:'donation', processor:'winred', payload:{...}}))</w:t>
             </w:r>
           </w:p>
           <w:p>
@@ -22892,7 +23134,7 @@
                 <w:sz w:val="17"/>
                 <w:szCs w:val="17"/>
               </w:rPr>
-              <w:t xml:space="preserve">  id              UUID DEFAULT gen_random_uuid() PRIMARY KEY,</w:t>
+              <w:t xml:space="preserve"/>
             </w:r>
           </w:p>
           <w:p>
@@ -22906,7 +23148,7 @@
                 <w:sz w:val="17"/>
                 <w:szCs w:val="17"/>
               </w:rPr>
-              <w:t xml:space="preserve">  candidate_id    TEXT NOT NULL,</w:t>
+              <w:t xml:space="preserve">-- Step 2: brain worker (MISSING — needs to be built) consumes Redis,</w:t>
             </w:r>
           </w:p>
           <w:p>
@@ -22920,7 +23162,7 @@
                 <w:sz w:val="17"/>
                 <w:szCs w:val="17"/>
               </w:rPr>
-              <w:t xml:space="preserve">  processor       TEXT NOT NULL CHECK (processor IN ('winred','anedot')),</w:t>
+              <w:t xml:space="preserve">-- writes to brain.event_queue, routes to pipeline.inbound_data_queue:</w:t>
             </w:r>
           </w:p>
           <w:p>
@@ -22934,7 +23176,7 @@
                 <w:sz w:val="17"/>
                 <w:szCs w:val="17"/>
               </w:rPr>
-              <w:t xml:space="preserve">  co_admin_email  TEXT NOT NULL,</w:t>
+              <w:t xml:space="preserve">INSERT INTO pipeline.inbound_data_queue</w:t>
             </w:r>
           </w:p>
           <w:p>
@@ -22948,7 +23190,7 @@
                 <w:sz w:val="17"/>
                 <w:szCs w:val="17"/>
               </w:rPr>
-              <w:t xml:space="preserve">  access_level    TEXT DEFAULT 'reporting',  -- 'reporting' | 'full_admin'</w:t>
+              <w:t xml:space="preserve">  (source_id, source_name, source_record_id, candidate_id, data_type, payload, priority)</w:t>
             </w:r>
           </w:p>
           <w:p>
@@ -22962,7 +23204,7 @@
                 <w:sz w:val="17"/>
                 <w:szCs w:val="17"/>
               </w:rPr>
-              <w:t xml:space="preserve">  webhook_secret  TEXT,  -- stored encrypted; used for HMAC verification</w:t>
+              <w:t xml:space="preserve">VALUES (</w:t>
             </w:r>
           </w:p>
           <w:p>
@@ -22976,7 +23218,7 @@
                 <w:sz w:val="17"/>
                 <w:szCs w:val="17"/>
               </w:rPr>
-              <w:t xml:space="preserve">  active          BOOLEAN DEFAULT TRUE,</w:t>
+              <w:t xml:space="preserve">  'uuid-of-winred-data-source',  -- from pipeline.data_sources</w:t>
             </w:r>
           </w:p>
           <w:p>
@@ -22990,7 +23232,7 @@
                 <w:sz w:val="17"/>
                 <w:szCs w:val="17"/>
               </w:rPr>
-              <w:t xml:space="preserve">  UNIQUE(candidate_id, processor)</w:t>
+              <w:t xml:space="preserve">  'WinRed',</w:t>
             </w:r>
           </w:p>
           <w:p>
@@ -23004,7 +23246,7 @@
                 <w:sz w:val="17"/>
                 <w:szCs w:val="17"/>
               </w:rPr>
-              <w:t xml:space="preserve">);</w:t>
+              <w:t xml:space="preserve">  'WR_TXN_9988776',              -- processor transaction ID (dedup key)</w:t>
             </w:r>
           </w:p>
           <w:p>
@@ -23018,7 +23260,7 @@
                 <w:sz w:val="17"/>
                 <w:szCs w:val="17"/>
               </w:rPr>
-              <w:t xml:space="preserve"/>
+              <w:t xml:space="preserve">  'uuid-of-candidate',</w:t>
             </w:r>
           </w:p>
           <w:p>
@@ -23032,7 +23274,7 @@
                 <w:sz w:val="17"/>
                 <w:szCs w:val="17"/>
               </w:rPr>
-              <w:t xml:space="preserve">-- Campaign source codes (how each transaction is attributed)</w:t>
+              <w:t xml:space="preserve">  'donation',</w:t>
             </w:r>
           </w:p>
           <w:p>
@@ -23046,7 +23288,7 @@
                 <w:sz w:val="17"/>
                 <w:szCs w:val="17"/>
               </w:rPr>
-              <w:t xml:space="preserve">CREATE TABLE campaign_codes (</w:t>
+              <w:t xml:space="preserve">  '{"amount":500,"donor_name":"J Smith","email":"j@smith.com","zip":"28604"}'::jsonb,</w:t>
             </w:r>
           </w:p>
           <w:p>
@@ -23060,7 +23302,7 @@
                 <w:sz w:val="17"/>
                 <w:szCs w:val="17"/>
               </w:rPr>
-              <w:t xml:space="preserve">  id           UUID DEFAULT gen_random_uuid() PRIMARY KEY,</w:t>
+              <w:t xml:space="preserve">  75  -- high priority</w:t>
             </w:r>
           </w:p>
           <w:p>
@@ -23074,7 +23316,7 @@
                 <w:sz w:val="17"/>
                 <w:szCs w:val="17"/>
               </w:rPr>
-              <w:t xml:space="preserve">  candidate_id TEXT NOT NULL,</w:t>
+              <w:t xml:space="preserve">);</w:t>
             </w:r>
           </w:p>
           <w:p>
@@ -23088,7 +23330,7 @@
                 <w:sz w:val="17"/>
                 <w:szCs w:val="17"/>
               </w:rPr>
-              <w:t xml:space="preserve">  processor    TEXT NOT NULL,</w:t>
+              <w:t xml:space="preserve"/>
             </w:r>
           </w:p>
           <w:p>
@@ -23102,7 +23344,7 @@
                 <w:sz w:val="17"/>
                 <w:szCs w:val="17"/>
               </w:rPr>
-              <w:t xml:space="preserve">  code         TEXT NOT NULL,  -- e.g. 'NC_GOV_2026_EMAIL_Q1'</w:t>
+              <w:t xml:space="preserve">-- Step 3: processing worker matches donor to person_master, writes contribution_map:</w:t>
             </w:r>
           </w:p>
           <w:p>
@@ -23116,7 +23358,7 @@
                 <w:sz w:val="17"/>
                 <w:szCs w:val="17"/>
               </w:rPr>
-              <w:t xml:space="preserve">  channel      TEXT,           -- 'email','sms','direct_mail','digital'</w:t>
+              <w:t xml:space="preserve">INSERT INTO donor_intelligence.contribution_map</w:t>
             </w:r>
           </w:p>
           <w:p>
@@ -23130,7 +23372,7 @@
                 <w:sz w:val="17"/>
                 <w:szCs w:val="17"/>
               </w:rPr>
-              <w:t xml:space="preserve">  description  TEXT,</w:t>
+              <w:t xml:space="preserve">  (person_id, source_system, source_row_id, amount, donation_date,</w:t>
             </w:r>
           </w:p>
           <w:p>
@@ -23144,7 +23386,7 @@
                 <w:sz w:val="17"/>
                 <w:szCs w:val="17"/>
               </w:rPr>
-              <w:t xml:space="preserve">  active       BOOLEAN DEFAULT TRUE</w:t>
+              <w:t xml:space="preserve">   committee_id, committee_name, candidate_name, match_method, match_confidence)</w:t>
             </w:r>
           </w:p>
           <w:p>
@@ -23158,7 +23400,7 @@
                 <w:sz w:val="17"/>
                 <w:szCs w:val="17"/>
               </w:rPr>
-              <w:t xml:space="preserve">);</w:t>
+              <w:t xml:space="preserve">VALUES</w:t>
             </w:r>
           </w:p>
           <w:p>
@@ -23172,7 +23414,7 @@
                 <w:sz w:val="17"/>
                 <w:szCs w:val="17"/>
               </w:rPr>
-              <w:t xml:space="preserve"/>
+              <w:t xml:space="preserve">  ('person-master-uuid', 'winred', 12345, 500.00, '2026-04-13',</w:t>
             </w:r>
           </w:p>
           <w:p>
@@ -23186,217 +23428,7 @@
                 <w:sz w:val="17"/>
                 <w:szCs w:val="17"/>
               </w:rPr>
-              <w:t xml:space="preserve">-- Inbound donation record (written from webhook, never from direct capture)</w:t>
-            </w:r>
-          </w:p>
-          <w:p>
-            <w:pPr>
-              <w:spacing w:after="0" w:before="0"/>
-            </w:pPr>
-            <w:r>
-              <w:rPr>
-                <w:rFonts w:ascii="Courier New" w:cs="Courier New" w:eastAsia="Courier New" w:hAnsi="Courier New"/>
-                <w:color w:val="A5D6FF"/>
-                <w:sz w:val="17"/>
-                <w:szCs w:val="17"/>
-              </w:rPr>
-              <w:t xml:space="preserve">CREATE TABLE donations (</w:t>
-            </w:r>
-          </w:p>
-          <w:p>
-            <w:pPr>
-              <w:spacing w:after="0" w:before="0"/>
-            </w:pPr>
-            <w:r>
-              <w:rPr>
-                <w:rFonts w:ascii="Courier New" w:cs="Courier New" w:eastAsia="Courier New" w:hAnsi="Courier New"/>
-                <w:color w:val="A5D6FF"/>
-                <w:sz w:val="17"/>
-                <w:szCs w:val="17"/>
-              </w:rPr>
-              <w:t xml:space="preserve">  id                    UUID DEFAULT gen_random_uuid() PRIMARY KEY,</w:t>
-            </w:r>
-          </w:p>
-          <w:p>
-            <w:pPr>
-              <w:spacing w:after="0" w:before="0"/>
-            </w:pPr>
-            <w:r>
-              <w:rPr>
-                <w:rFonts w:ascii="Courier New" w:cs="Courier New" w:eastAsia="Courier New" w:hAnsi="Courier New"/>
-                <w:color w:val="A5D6FF"/>
-                <w:sz w:val="17"/>
-                <w:szCs w:val="17"/>
-              </w:rPr>
-              <w:t xml:space="preserve">  processor             TEXT NOT NULL,  -- 'winred' | 'anedot'</w:t>
-            </w:r>
-          </w:p>
-          <w:p>
-            <w:pPr>
-              <w:spacing w:after="0" w:before="0"/>
-            </w:pPr>
-            <w:r>
-              <w:rPr>
-                <w:rFonts w:ascii="Courier New" w:cs="Courier New" w:eastAsia="Courier New" w:hAnsi="Courier New"/>
-                <w:color w:val="A5D6FF"/>
-                <w:sz w:val="17"/>
-                <w:szCs w:val="17"/>
-              </w:rPr>
-              <w:t xml:space="preserve">  processor_txn_id      TEXT NOT NULL UNIQUE,  -- prevents duplicate replay</w:t>
-            </w:r>
-          </w:p>
-          <w:p>
-            <w:pPr>
-              <w:spacing w:after="0" w:before="0"/>
-            </w:pPr>
-            <w:r>
-              <w:rPr>
-                <w:rFonts w:ascii="Courier New" w:cs="Courier New" w:eastAsia="Courier New" w:hAnsi="Courier New"/>
-                <w:color w:val="A5D6FF"/>
-                <w:sz w:val="17"/>
-                <w:szCs w:val="17"/>
-              </w:rPr>
-              <w:t xml:space="preserve">  candidate_id          TEXT NOT NULL,</w:t>
-            </w:r>
-          </w:p>
-          <w:p>
-            <w:pPr>
-              <w:spacing w:after="0" w:before="0"/>
-            </w:pPr>
-            <w:r>
-              <w:rPr>
-                <w:rFonts w:ascii="Courier New" w:cs="Courier New" w:eastAsia="Courier New" w:hAnsi="Courier New"/>
-                <w:color w:val="A5D6FF"/>
-                <w:sz w:val="17"/>
-                <w:szCs w:val="17"/>
-              </w:rPr>
-              <w:t xml:space="preserve">  person_id             UUID REFERENCES person_spine(id),  -- resolved identity</w:t>
-            </w:r>
-          </w:p>
-          <w:p>
-            <w:pPr>
-              <w:spacing w:after="0" w:before="0"/>
-            </w:pPr>
-            <w:r>
-              <w:rPr>
-                <w:rFonts w:ascii="Courier New" w:cs="Courier New" w:eastAsia="Courier New" w:hAnsi="Courier New"/>
-                <w:color w:val="A5D6FF"/>
-                <w:sz w:val="17"/>
-                <w:szCs w:val="17"/>
-              </w:rPr>
-              <w:t xml:space="preserve">  campaign_code         TEXT,</w:t>
-            </w:r>
-          </w:p>
-          <w:p>
-            <w:pPr>
-              <w:spacing w:after="0" w:before="0"/>
-            </w:pPr>
-            <w:r>
-              <w:rPr>
-                <w:rFonts w:ascii="Courier New" w:cs="Courier New" w:eastAsia="Courier New" w:hAnsi="Courier New"/>
-                <w:color w:val="A5D6FF"/>
-                <w:sz w:val="17"/>
-                <w:szCs w:val="17"/>
-              </w:rPr>
-              <w:t xml:space="preserve">  amount                NUMERIC(10,2) NOT NULL,</w:t>
-            </w:r>
-          </w:p>
-          <w:p>
-            <w:pPr>
-              <w:spacing w:after="0" w:before="0"/>
-            </w:pPr>
-            <w:r>
-              <w:rPr>
-                <w:rFonts w:ascii="Courier New" w:cs="Courier New" w:eastAsia="Courier New" w:hAnsi="Courier New"/>
-                <w:color w:val="A5D6FF"/>
-                <w:sz w:val="17"/>
-                <w:szCs w:val="17"/>
-              </w:rPr>
-              <w:t xml:space="preserve">  donated_at            TIMESTAMPTZ NOT NULL,</w:t>
-            </w:r>
-          </w:p>
-          <w:p>
-            <w:pPr>
-              <w:spacing w:after="0" w:before="0"/>
-            </w:pPr>
-            <w:r>
-              <w:rPr>
-                <w:rFonts w:ascii="Courier New" w:cs="Courier New" w:eastAsia="Courier New" w:hAnsi="Courier New"/>
-                <w:color w:val="A5D6FF"/>
-                <w:sz w:val="17"/>
-                <w:szCs w:val="17"/>
-              </w:rPr>
-              <w:t xml:space="preserve">  received_at           TIMESTAMPTZ DEFAULT now(),</w:t>
-            </w:r>
-          </w:p>
-          <w:p>
-            <w:pPr>
-              <w:spacing w:after="0" w:before="0"/>
-            </w:pPr>
-            <w:r>
-              <w:rPr>
-                <w:rFonts w:ascii="Courier New" w:cs="Courier New" w:eastAsia="Courier New" w:hAnsi="Courier New"/>
-                <w:color w:val="A5D6FF"/>
-                <w:sz w:val="17"/>
-                <w:szCs w:val="17"/>
-              </w:rPr>
-              <w:t xml:space="preserve">  identity_confidence   FLOAT,  -- from match_person()</w:t>
-            </w:r>
-          </w:p>
-          <w:p>
-            <w:pPr>
-              <w:spacing w:after="0" w:before="0"/>
-            </w:pPr>
-            <w:r>
-              <w:rPr>
-                <w:rFonts w:ascii="Courier New" w:cs="Courier New" w:eastAsia="Courier New" w:hAnsi="Courier New"/>
-                <w:color w:val="A5D6FF"/>
-                <w:sz w:val="17"/>
-                <w:szCs w:val="17"/>
-              </w:rPr>
-              <w:t xml:space="preserve">  integrity_status      TEXT DEFAULT 'clean',  -- 'clean'|'queued'|'corrected'|'voided'</w:t>
-            </w:r>
-          </w:p>
-          <w:p>
-            <w:pPr>
-              <w:spacing w:after="0" w:before="0"/>
-            </w:pPr>
-            <w:r>
-              <w:rPr>
-                <w:rFonts w:ascii="Courier New" w:cs="Courier New" w:eastAsia="Courier New" w:hAnsi="Courier New"/>
-                <w:color w:val="A5D6FF"/>
-                <w:sz w:val="17"/>
-                <w:szCs w:val="17"/>
-              </w:rPr>
-              <w:t xml:space="preserve">  fec_period            TEXT,  -- 'Q1_2026', 'Q2_2026', etc.</w:t>
-            </w:r>
-          </w:p>
-          <w:p>
-            <w:pPr>
-              <w:spacing w:after="0" w:before="0"/>
-            </w:pPr>
-            <w:r>
-              <w:rPr>
-                <w:rFonts w:ascii="Courier New" w:cs="Courier New" w:eastAsia="Courier New" w:hAnsi="Courier New"/>
-                <w:color w:val="A5D6FF"/>
-                <w:sz w:val="17"/>
-                <w:szCs w:val="17"/>
-              </w:rPr>
-              <w:t xml:space="preserve">  raw_webhook_payload   JSONB  -- original processor payload, immutable</w:t>
-            </w:r>
-          </w:p>
-          <w:p>
-            <w:pPr>
-              <w:spacing w:after="0" w:before="0"/>
-            </w:pPr>
-            <w:r>
-              <w:rPr>
-                <w:rFonts w:ascii="Courier New" w:cs="Courier New" w:eastAsia="Courier New" w:hAnsi="Courier New"/>
-                <w:color w:val="A5D6FF"/>
-                <w:sz w:val="17"/>
-                <w:szCs w:val="17"/>
-              </w:rPr>
-              <w:t xml:space="preserve">);</w:t>
+              <w:t xml:space="preserve">   'C00123456', 'Smith for NC', 'John Smith', 'email_exact', 0.98);</w:t>
             </w:r>
           </w:p>
         </w:tc>
@@ -23439,7 +23471,7 @@
                 <w:sz w:val="18"/>
                 <w:szCs w:val="18"/>
               </w:rPr>
-              <w:t xml:space="preserve">The co-admin model is architecturally elegant: BGOP gets all the data and reporting capability with zero payment liability. The candidate's campaign committee retains full financial and FEC compliance ownership. WinRed and Anedot handle PCI, fraud, and 48-hour large-donor reporting. BGOP handles identity resolution, campaign attribution, and quarterly consolidated reporting. The raw_webhook_payload column is the immutable receipt — if anything is ever disputed, BGOP can show exactly what the processor reported, unmodified, with a timestamp.</w:t>
+              <w:t xml:space="preserve">No standalone donations table is needed — the existing pipeline architecture handles it. pipeline.inbound_data_queue is the universal intake. contribution_map is the final attribution record. The co-admin model keeps BGOP completely outside PCI scope. The one gap: the brain worker that subscribes to Redis bgop:events and routes inbound donation events into the processing pipeline is not yet running. relay.py receives the webhook. Redis holds the signal. The worker to drain it is the missing link.</w:t>
             </w:r>
           </w:p>
         </w:tc>
@@ -23474,15 +23506,73 @@
     </w:p>
     <w:p>
       <w:pPr>
-        <w:spacing w:after="180"/>
+        <w:spacing w:after="120"/>
       </w:pPr>
       <w:r>
         <w:rPr>
           <w:rFonts w:ascii="Arial" w:cs="Arial" w:eastAsia="Arial" w:hAnsi="Arial"/>
         </w:rPr>
-        <w:t xml:space="preserve">These twelve configuration domains map to four implementation waves, ordered by risk mitigation value and dependency sequencing. Wave 1 addresses foundation — nothing else can be built cleanly without it.</w:t>
+        <w:t xml:space="preserve">These fourteen configuration domains map to four implementation waves, ordered by risk mitigation value and dependency sequencing. Wave 1 addresses foundation — nothing else can be built cleanly without it.</w:t>
       </w:r>
     </w:p>
+    <w:tbl>
+      <w:tblPr>
+        <w:tblW w:type="dxa" w:w="9360"/>
+        <w:tblBorders>
+          <w:top w:val="single" w:color="auto" w:sz="4"/>
+          <w:left w:val="single" w:color="auto" w:sz="4"/>
+          <w:bottom w:val="single" w:color="auto" w:sz="4"/>
+          <w:right w:val="single" w:color="auto" w:sz="4"/>
+          <w:insideH w:val="single" w:color="auto" w:sz="4"/>
+          <w:insideV w:val="single" w:color="auto" w:sz="4"/>
+        </w:tblBorders>
+      </w:tblPr>
+      <w:tblGrid>
+        <w:gridCol w:w="9360"/>
+      </w:tblGrid>
+      <w:tr>
+        <w:tc>
+          <w:tcPr>
+            <w:tcBorders>
+              <w:top w:val="single" w:color="E8711A" w:sz="8"/>
+              <w:left w:val="none" w:color="FFFFFF" w:sz="0"/>
+              <w:bottom w:val="single" w:color="E8711A" w:sz="8"/>
+              <w:right w:val="none" w:color="FFFFFF" w:sz="0"/>
+            </w:tcBorders>
+            <w:shd w:fill="FFFFFF" w:val="clear"/>
+            <w:tcMar>
+              <w:top w:type="dxa" w:w="120"/>
+              <w:left w:type="dxa" w:w="200"/>
+              <w:bottom w:type="dxa" w:w="120"/>
+              <w:right w:type="dxa" w:w="200"/>
+            </w:tcMar>
+          </w:tcPr>
+          <w:p>
+            <w:r>
+              <w:rPr>
+                <w:rFonts w:ascii="Arial" w:cs="Arial" w:eastAsia="Arial" w:hAnsi="Arial"/>
+                <w:b/>
+                <w:bCs/>
+                <w:color w:val="E8711A"/>
+                <w:sz w:val="18"/>
+                <w:szCs w:val="18"/>
+              </w:rPr>
+              <w:t xml:space="preserve">CRITICAL GAP — BRAIN WORKER NOT RUNNING:  </w:t>
+            </w:r>
+            <w:r>
+              <w:rPr>
+                <w:rFonts w:ascii="Arial" w:cs="Arial" w:eastAsia="Arial" w:hAnsi="Arial"/>
+                <w:i/>
+                <w:iCs/>
+                <w:sz w:val="18"/>
+                <w:szCs w:val="18"/>
+              </w:rPr>
+              <w:t xml:space="preserve">relay.py receives webhooks on port 8080. Redis pub/sub (bgop:events channel) is live. brain.event_queue (partitioned PG table) is ready. The Python worker that subscribes to bgop:events, evaluates events through the trigger engine, and drains brain.event_queue is not yet deployed. Events arrive at relay.py, Redis holds the signal — and nothing processes it. Supabase (project isbgjpnbocdkeslofota) handles agent_messages and brain_decisions only; all heavy data is on Hetzner PG16. The brain worker is the missing link between a platform with installed infrastructure and one that actually runs autonomously.</w:t>
+            </w:r>
+          </w:p>
+        </w:tc>
+      </w:tr>
+    </w:tbl>
     <w:tbl>
       <w:tblPr>
         <w:tblW w:type="dxa" w:w="9360"/>
@@ -23781,7 +23871,7 @@
                 <w:sz w:val="17"/>
                 <w:szCs w:val="17"/>
               </w:rPr>
-              <w:t xml:space="preserve">Zero hardcoded secrets. Credential rotation takes seconds. RLS enforced. Donation webhooks flowing into person_spine with zero PCI scope for BGOP.</w:t>
+              <w:t xml:space="preserve">Zero hardcoded secrets. Credential rotation takes seconds. RLS enforced. Donation webhooks flowing into donor_intelligence.person_master with zero PCI scope for BGOP.</w:t>
             </w:r>
           </w:p>
         </w:tc>

</xml_diff>